<commit_message>
Complete AutoLoc classes and association deliverable - Tests: 2/2 passed
Map the Agence-Employe association and verify its generated foreign key.
Document all nine entity classes and five enums with code captures.
Attach phpMyAdmin screenshots of the generated database, tables, and relations.

Co-authored-by: Copilot <223556219+Copilot@users.noreply.github.com>
</commit_message>
<xml_diff>
--- a/Rapport_Associations_AutoLoc.docx
+++ b/Rapport_Associations_AutoLoc.docx
@@ -8,7 +8,7 @@
         <w:jc w:val="center"/>
       </w:pPr>
       <w:r>
-        <w:t>Associations entre les entités AutoLoc</w:t>
+        <w:t>Modèle de classes et associations AutoLoc</w:t>
       </w:r>
     </w:p>
     <w:p>
@@ -16,12 +16,7 @@
         <w:jc w:val="center"/>
       </w:pPr>
       <w:r>
-        <w:t>Implémentation JPA et preuve du schéma généré dans phpMyAdmin</w:t>
-      </w:r>
-    </w:p>
-    <w:p>
-      <w:r>
-        <w:t>Application : AutoLoc API  |  Java : 25 LTS  |  Base créée : autoloc_db_associations</w:t>
+        <w:t>Code Java complet des entités et énumérations; schéma généré et vérifié dans phpMyAdmin</w:t>
       </w:r>
     </w:p>
     <w:p>
@@ -29,7 +24,12 @@
         <w:pStyle w:val="Heading1"/>
       </w:pPr>
       <w:r>
-        <w:t>Associations implémentées</w:t>
+        <w:t>Synthèse du modèle</w:t>
+      </w:r>
+    </w:p>
+    <w:p>
+      <w:r>
+        <w:t>L?implémentation couvre les 9 entités et les 5 énumérations du diagramme fourni, ainsi que les associations indiquées. Hibernate a généré le schéma dans la nouvelle base autoloc_db_classes; la base autoloc_db est conservée.</w:t>
       </w:r>
     </w:p>
     <w:tbl>
@@ -39,38 +39,38 @@
         <w:tblLook w:firstColumn="1" w:firstRow="1" w:lastColumn="0" w:lastRow="0" w:noHBand="0" w:noVBand="1" w:val="04A0"/>
       </w:tblPr>
       <w:tblGrid>
-        <w:gridCol w:w="3456"/>
-        <w:gridCol w:w="3456"/>
-        <w:gridCol w:w="3456"/>
+        <w:gridCol w:w="3394"/>
+        <w:gridCol w:w="3394"/>
+        <w:gridCol w:w="3394"/>
       </w:tblGrid>
       <w:tr>
         <w:tc>
           <w:tcPr>
-            <w:tcW w:type="dxa" w:w="3456"/>
+            <w:tcW w:type="dxa" w:w="3394"/>
           </w:tcPr>
           <w:p>
             <w:r>
-              <w:t>Relation</w:t>
+              <w:t>Association</w:t>
             </w:r>
           </w:p>
         </w:tc>
         <w:tc>
           <w:tcPr>
-            <w:tcW w:type="dxa" w:w="3456"/>
+            <w:tcW w:type="dxa" w:w="3394"/>
           </w:tcPr>
           <w:p>
             <w:r>
-              <w:t>Cardinalit?</w:t>
+              <w:t>Cardinalité</w:t>
             </w:r>
           </w:p>
         </w:tc>
         <w:tc>
           <w:tcPr>
-            <w:tcW w:type="dxa" w:w="3456"/>
+            <w:tcW w:type="dxa" w:w="3394"/>
           </w:tcPr>
           <w:p>
             <w:r>
-              <w:t>Cl? / table g?n?r?e</w:t>
+              <w:t>Structure générée</w:t>
             </w:r>
           </w:p>
         </w:tc>
@@ -78,17 +78,17 @@
       <w:tr>
         <w:tc>
           <w:tcPr>
-            <w:tcW w:type="dxa" w:w="3456"/>
+            <w:tcW w:type="dxa" w:w="3394"/>
           </w:tcPr>
           <w:p>
             <w:r>
-              <w:t>Agence ? V?hicule</w:t>
+              <w:t>Agence - Employe</w:t>
             </w:r>
           </w:p>
         </w:tc>
         <w:tc>
           <w:tcPr>
-            <w:tcW w:type="dxa" w:w="3456"/>
+            <w:tcW w:type="dxa" w:w="3394"/>
           </w:tcPr>
           <w:p>
             <w:r>
@@ -98,7 +98,39 @@
         </w:tc>
         <w:tc>
           <w:tcPr>
-            <w:tcW w:type="dxa" w:w="3456"/>
+            <w:tcW w:type="dxa" w:w="3394"/>
+          </w:tcPr>
+          <w:p>
+            <w:r>
+              <w:t>employe.id_agence</w:t>
+            </w:r>
+          </w:p>
+        </w:tc>
+      </w:tr>
+      <w:tr>
+        <w:tc>
+          <w:tcPr>
+            <w:tcW w:type="dxa" w:w="3394"/>
+          </w:tcPr>
+          <w:p>
+            <w:r>
+              <w:t>Agence - Vehicule</w:t>
+            </w:r>
+          </w:p>
+        </w:tc>
+        <w:tc>
+          <w:tcPr>
+            <w:tcW w:type="dxa" w:w="3394"/>
+          </w:tcPr>
+          <w:p>
+            <w:r>
+              <w:t>1:N</w:t>
+            </w:r>
+          </w:p>
+        </w:tc>
+        <w:tc>
+          <w:tcPr>
+            <w:tcW w:type="dxa" w:w="3394"/>
           </w:tcPr>
           <w:p>
             <w:r>
@@ -110,17 +142,17 @@
       <w:tr>
         <w:tc>
           <w:tcPr>
-            <w:tcW w:type="dxa" w:w="3456"/>
+            <w:tcW w:type="dxa" w:w="3394"/>
           </w:tcPr>
           <w:p>
             <w:r>
-              <w:t>Client ? R?servation</w:t>
+              <w:t>Client - Reservation</w:t>
             </w:r>
           </w:p>
         </w:tc>
         <w:tc>
           <w:tcPr>
-            <w:tcW w:type="dxa" w:w="3456"/>
+            <w:tcW w:type="dxa" w:w="3394"/>
           </w:tcPr>
           <w:p>
             <w:r>
@@ -130,7 +162,7 @@
         </w:tc>
         <w:tc>
           <w:tcPr>
-            <w:tcW w:type="dxa" w:w="3456"/>
+            <w:tcW w:type="dxa" w:w="3394"/>
           </w:tcPr>
           <w:p>
             <w:r>
@@ -142,17 +174,17 @@
       <w:tr>
         <w:tc>
           <w:tcPr>
-            <w:tcW w:type="dxa" w:w="3456"/>
+            <w:tcW w:type="dxa" w:w="3394"/>
           </w:tcPr>
           <w:p>
             <w:r>
-              <w:t>V?hicule ? R?servation</w:t>
+              <w:t>Vehicule - Reservation</w:t>
             </w:r>
           </w:p>
         </w:tc>
         <w:tc>
           <w:tcPr>
-            <w:tcW w:type="dxa" w:w="3456"/>
+            <w:tcW w:type="dxa" w:w="3394"/>
           </w:tcPr>
           <w:p>
             <w:r>
@@ -162,7 +194,7 @@
         </w:tc>
         <w:tc>
           <w:tcPr>
-            <w:tcW w:type="dxa" w:w="3456"/>
+            <w:tcW w:type="dxa" w:w="3394"/>
           </w:tcPr>
           <w:p>
             <w:r>
@@ -174,17 +206,49 @@
       <w:tr>
         <w:tc>
           <w:tcPr>
-            <w:tcW w:type="dxa" w:w="3456"/>
+            <w:tcW w:type="dxa" w:w="3394"/>
           </w:tcPr>
           <w:p>
             <w:r>
-              <w:t>Contrat ? R?servation</w:t>
+              <w:t>Vehicule - Maintenance</w:t>
             </w:r>
           </w:p>
         </w:tc>
         <w:tc>
           <w:tcPr>
-            <w:tcW w:type="dxa" w:w="3456"/>
+            <w:tcW w:type="dxa" w:w="3394"/>
+          </w:tcPr>
+          <w:p>
+            <w:r>
+              <w:t>1:N</w:t>
+            </w:r>
+          </w:p>
+        </w:tc>
+        <w:tc>
+          <w:tcPr>
+            <w:tcW w:type="dxa" w:w="3394"/>
+          </w:tcPr>
+          <w:p>
+            <w:r>
+              <w:t>maintenance.id_vehicule</w:t>
+            </w:r>
+          </w:p>
+        </w:tc>
+      </w:tr>
+      <w:tr>
+        <w:tc>
+          <w:tcPr>
+            <w:tcW w:type="dxa" w:w="3394"/>
+          </w:tcPr>
+          <w:p>
+            <w:r>
+              <w:t>Contrat - Reservation</w:t>
+            </w:r>
+          </w:p>
+        </w:tc>
+        <w:tc>
+          <w:tcPr>
+            <w:tcW w:type="dxa" w:w="3394"/>
           </w:tcPr>
           <w:p>
             <w:r>
@@ -194,7 +258,7 @@
         </w:tc>
         <w:tc>
           <w:tcPr>
-            <w:tcW w:type="dxa" w:w="3456"/>
+            <w:tcW w:type="dxa" w:w="3394"/>
           </w:tcPr>
           <w:p>
             <w:r>
@@ -206,17 +270,17 @@
       <w:tr>
         <w:tc>
           <w:tcPr>
-            <w:tcW w:type="dxa" w:w="3456"/>
+            <w:tcW w:type="dxa" w:w="3394"/>
           </w:tcPr>
           <w:p>
             <w:r>
-              <w:t>Contrat ? Paiement</w:t>
+              <w:t>Contrat - Paiement</w:t>
             </w:r>
           </w:p>
         </w:tc>
         <w:tc>
           <w:tcPr>
-            <w:tcW w:type="dxa" w:w="3456"/>
+            <w:tcW w:type="dxa" w:w="3394"/>
           </w:tcPr>
           <w:p>
             <w:r>
@@ -226,11 +290,11 @@
         </w:tc>
         <w:tc>
           <w:tcPr>
-            <w:tcW w:type="dxa" w:w="3456"/>
+            <w:tcW w:type="dxa" w:w="3394"/>
           </w:tcPr>
           <w:p>
             <w:r>
-              <w:t>table de jointure contrat_paiements</w:t>
+              <w:t>contrat_paiements</w:t>
             </w:r>
           </w:p>
         </w:tc>
@@ -238,17 +302,17 @@
       <w:tr>
         <w:tc>
           <w:tcPr>
-            <w:tcW w:type="dxa" w:w="3456"/>
+            <w:tcW w:type="dxa" w:w="3394"/>
           </w:tcPr>
           <w:p>
             <w:r>
-              <w:t>V?hicule ? ?quipement</w:t>
+              <w:t>Vehicule - Equipement</w:t>
             </w:r>
           </w:p>
         </w:tc>
         <w:tc>
           <w:tcPr>
-            <w:tcW w:type="dxa" w:w="3456"/>
+            <w:tcW w:type="dxa" w:w="3394"/>
           </w:tcPr>
           <w:p>
             <w:r>
@@ -258,43 +322,11 @@
         </w:tc>
         <w:tc>
           <w:tcPr>
-            <w:tcW w:type="dxa" w:w="3456"/>
+            <w:tcW w:type="dxa" w:w="3394"/>
           </w:tcPr>
           <w:p>
             <w:r>
-              <w:t>table de jointure vehicule_equipement</w:t>
-            </w:r>
-          </w:p>
-        </w:tc>
-      </w:tr>
-      <w:tr>
-        <w:tc>
-          <w:tcPr>
-            <w:tcW w:type="dxa" w:w="3456"/>
-          </w:tcPr>
-          <w:p>
-            <w:r>
-              <w:t>V?hicule ? Maintenance</w:t>
-            </w:r>
-          </w:p>
-        </w:tc>
-        <w:tc>
-          <w:tcPr>
-            <w:tcW w:type="dxa" w:w="3456"/>
-          </w:tcPr>
-          <w:p>
-            <w:r>
-              <w:t>1:N</w:t>
-            </w:r>
-          </w:p>
-        </w:tc>
-        <w:tc>
-          <w:tcPr>
-            <w:tcW w:type="dxa" w:w="3456"/>
-          </w:tcPr>
-          <w:p>
-            <w:r>
-              <w:t>maintenance.id_vehicule</w:t>
+              <w:t>vehicule_equipement</w:t>
             </w:r>
           </w:p>
         </w:tc>
@@ -302,7 +334,12 @@
     </w:tbl>
     <w:p>
       <w:r>
-        <w:t>La table contrat_paiements est la table de liaison créée par la collection de paiements du contrat. La table vehicule_equipement porte les deux clés étrangères du Many-to-Many. L’ancienne base autoloc_db est conservée : le démarrage vérifié utilise une base neuve et distincte.</w:t>
+        <w:t>Validation : 11 tables et 10 clés étrangères constatées dans MySQL/MariaDB; tests Java 25 réussis (2/2).</w:t>
+      </w:r>
+    </w:p>
+    <w:p>
+      <w:r>
+        <w:br w:type="page"/>
       </w:r>
     </w:p>
     <w:p>
@@ -310,15 +347,7 @@
         <w:pStyle w:val="Heading1"/>
       </w:pPr>
       <w:r>
-        <w:t>Captures du code des entités</w:t>
-      </w:r>
-    </w:p>
-    <w:p>
-      <w:pPr>
-        <w:pStyle w:val="Heading2"/>
-      </w:pPr>
-      <w:r>
-        <w:t>Agence</w:t>
+        <w:t>Diagramme de classes fourni pour l?étude de cas</w:t>
       </w:r>
     </w:p>
     <w:p>
@@ -328,7 +357,7 @@
       <w:r>
         <w:drawing>
           <wp:inline xmlns:a="http://schemas.openxmlformats.org/drawingml/2006/main" xmlns:pic="http://schemas.openxmlformats.org/drawingml/2006/picture">
-            <wp:extent cx="6355080" cy="959039"/>
+            <wp:extent cx="6309360" cy="6344559"/>
             <wp:docPr id="1" name="Picture 1"/>
             <wp:cNvGraphicFramePr>
               <a:graphicFrameLocks noChangeAspect="1"/>
@@ -337,7 +366,7 @@
               <a:graphicData uri="http://schemas.openxmlformats.org/drawingml/2006/picture">
                 <pic:pic>
                   <pic:nvPicPr>
-                    <pic:cNvPr id="0" name="autoloc-code-Agence.png"/>
+                    <pic:cNvPr id="0" name="Pasted Image.png"/>
                     <pic:cNvPicPr/>
                   </pic:nvPicPr>
                   <pic:blipFill>
@@ -349,289 +378,7 @@
                   <pic:spPr>
                     <a:xfrm>
                       <a:off x="0" y="0"/>
-                      <a:ext cx="6355080" cy="959039"/>
-                    </a:xfrm>
-                    <a:prstGeom prst="rect"/>
-                  </pic:spPr>
-                </pic:pic>
-              </a:graphicData>
-            </a:graphic>
-          </wp:inline>
-        </w:drawing>
-      </w:r>
-    </w:p>
-    <w:p>
-      <w:pPr>
-        <w:pStyle w:val="Heading2"/>
-      </w:pPr>
-      <w:r>
-        <w:t>Client</w:t>
-      </w:r>
-    </w:p>
-    <w:p>
-      <w:pPr>
-        <w:jc w:val="center"/>
-      </w:pPr>
-      <w:r>
-        <w:drawing>
-          <wp:inline xmlns:a="http://schemas.openxmlformats.org/drawingml/2006/main" xmlns:pic="http://schemas.openxmlformats.org/drawingml/2006/picture">
-            <wp:extent cx="6355080" cy="959039"/>
-            <wp:docPr id="2" name="Picture 2"/>
-            <wp:cNvGraphicFramePr>
-              <a:graphicFrameLocks noChangeAspect="1"/>
-            </wp:cNvGraphicFramePr>
-            <a:graphic>
-              <a:graphicData uri="http://schemas.openxmlformats.org/drawingml/2006/picture">
-                <pic:pic>
-                  <pic:nvPicPr>
-                    <pic:cNvPr id="0" name="autoloc-code-Client.png"/>
-                    <pic:cNvPicPr/>
-                  </pic:nvPicPr>
-                  <pic:blipFill>
-                    <a:blip r:embed="rId12"/>
-                    <a:stretch>
-                      <a:fillRect/>
-                    </a:stretch>
-                  </pic:blipFill>
-                  <pic:spPr>
-                    <a:xfrm>
-                      <a:off x="0" y="0"/>
-                      <a:ext cx="6355080" cy="959039"/>
-                    </a:xfrm>
-                    <a:prstGeom prst="rect"/>
-                  </pic:spPr>
-                </pic:pic>
-              </a:graphicData>
-            </a:graphic>
-          </wp:inline>
-        </w:drawing>
-      </w:r>
-    </w:p>
-    <w:p>
-      <w:pPr>
-        <w:pStyle w:val="Heading2"/>
-      </w:pPr>
-      <w:r>
-        <w:t>Contrat</w:t>
-      </w:r>
-    </w:p>
-    <w:p>
-      <w:pPr>
-        <w:jc w:val="center"/>
-      </w:pPr>
-      <w:r>
-        <w:drawing>
-          <wp:inline xmlns:a="http://schemas.openxmlformats.org/drawingml/2006/main" xmlns:pic="http://schemas.openxmlformats.org/drawingml/2006/picture">
-            <wp:extent cx="6355080" cy="1600325"/>
-            <wp:docPr id="3" name="Picture 3"/>
-            <wp:cNvGraphicFramePr>
-              <a:graphicFrameLocks noChangeAspect="1"/>
-            </wp:cNvGraphicFramePr>
-            <a:graphic>
-              <a:graphicData uri="http://schemas.openxmlformats.org/drawingml/2006/picture">
-                <pic:pic>
-                  <pic:nvPicPr>
-                    <pic:cNvPr id="0" name="autoloc-code-Contrat.png"/>
-                    <pic:cNvPicPr/>
-                  </pic:nvPicPr>
-                  <pic:blipFill>
-                    <a:blip r:embed="rId13"/>
-                    <a:stretch>
-                      <a:fillRect/>
-                    </a:stretch>
-                  </pic:blipFill>
-                  <pic:spPr>
-                    <a:xfrm>
-                      <a:off x="0" y="0"/>
-                      <a:ext cx="6355080" cy="1600325"/>
-                    </a:xfrm>
-                    <a:prstGeom prst="rect"/>
-                  </pic:spPr>
-                </pic:pic>
-              </a:graphicData>
-            </a:graphic>
-          </wp:inline>
-        </w:drawing>
-      </w:r>
-    </w:p>
-    <w:p>
-      <w:pPr>
-        <w:pStyle w:val="Heading2"/>
-      </w:pPr>
-      <w:r>
-        <w:t>Equipement</w:t>
-      </w:r>
-    </w:p>
-    <w:p>
-      <w:pPr>
-        <w:jc w:val="center"/>
-      </w:pPr>
-      <w:r>
-        <w:drawing>
-          <wp:inline xmlns:a="http://schemas.openxmlformats.org/drawingml/2006/main" xmlns:pic="http://schemas.openxmlformats.org/drawingml/2006/picture">
-            <wp:extent cx="6355080" cy="959039"/>
-            <wp:docPr id="4" name="Picture 4"/>
-            <wp:cNvGraphicFramePr>
-              <a:graphicFrameLocks noChangeAspect="1"/>
-            </wp:cNvGraphicFramePr>
-            <a:graphic>
-              <a:graphicData uri="http://schemas.openxmlformats.org/drawingml/2006/picture">
-                <pic:pic>
-                  <pic:nvPicPr>
-                    <pic:cNvPr id="0" name="autoloc-code-Equipement.png"/>
-                    <pic:cNvPicPr/>
-                  </pic:nvPicPr>
-                  <pic:blipFill>
-                    <a:blip r:embed="rId14"/>
-                    <a:stretch>
-                      <a:fillRect/>
-                    </a:stretch>
-                  </pic:blipFill>
-                  <pic:spPr>
-                    <a:xfrm>
-                      <a:off x="0" y="0"/>
-                      <a:ext cx="6355080" cy="959039"/>
-                    </a:xfrm>
-                    <a:prstGeom prst="rect"/>
-                  </pic:spPr>
-                </pic:pic>
-              </a:graphicData>
-            </a:graphic>
-          </wp:inline>
-        </w:drawing>
-      </w:r>
-    </w:p>
-    <w:p>
-      <w:pPr>
-        <w:pStyle w:val="Heading2"/>
-      </w:pPr>
-      <w:r>
-        <w:t>Maintenance</w:t>
-      </w:r>
-    </w:p>
-    <w:p>
-      <w:pPr>
-        <w:jc w:val="center"/>
-      </w:pPr>
-      <w:r>
-        <w:drawing>
-          <wp:inline xmlns:a="http://schemas.openxmlformats.org/drawingml/2006/main" xmlns:pic="http://schemas.openxmlformats.org/drawingml/2006/picture">
-            <wp:extent cx="6355080" cy="1172801"/>
-            <wp:docPr id="5" name="Picture 5"/>
-            <wp:cNvGraphicFramePr>
-              <a:graphicFrameLocks noChangeAspect="1"/>
-            </wp:cNvGraphicFramePr>
-            <a:graphic>
-              <a:graphicData uri="http://schemas.openxmlformats.org/drawingml/2006/picture">
-                <pic:pic>
-                  <pic:nvPicPr>
-                    <pic:cNvPr id="0" name="autoloc-code-Maintenance.png"/>
-                    <pic:cNvPicPr/>
-                  </pic:nvPicPr>
-                  <pic:blipFill>
-                    <a:blip r:embed="rId15"/>
-                    <a:stretch>
-                      <a:fillRect/>
-                    </a:stretch>
-                  </pic:blipFill>
-                  <pic:spPr>
-                    <a:xfrm>
-                      <a:off x="0" y="0"/>
-                      <a:ext cx="6355080" cy="1172801"/>
-                    </a:xfrm>
-                    <a:prstGeom prst="rect"/>
-                  </pic:spPr>
-                </pic:pic>
-              </a:graphicData>
-            </a:graphic>
-          </wp:inline>
-        </w:drawing>
-      </w:r>
-    </w:p>
-    <w:p>
-      <w:pPr>
-        <w:pStyle w:val="Heading2"/>
-      </w:pPr>
-      <w:r>
-        <w:t>Reservation</w:t>
-      </w:r>
-    </w:p>
-    <w:p>
-      <w:pPr>
-        <w:jc w:val="center"/>
-      </w:pPr>
-      <w:r>
-        <w:drawing>
-          <wp:inline xmlns:a="http://schemas.openxmlformats.org/drawingml/2006/main" xmlns:pic="http://schemas.openxmlformats.org/drawingml/2006/picture">
-            <wp:extent cx="6355080" cy="2882895"/>
-            <wp:docPr id="6" name="Picture 6"/>
-            <wp:cNvGraphicFramePr>
-              <a:graphicFrameLocks noChangeAspect="1"/>
-            </wp:cNvGraphicFramePr>
-            <a:graphic>
-              <a:graphicData uri="http://schemas.openxmlformats.org/drawingml/2006/picture">
-                <pic:pic>
-                  <pic:nvPicPr>
-                    <pic:cNvPr id="0" name="autoloc-code-Reservation.png"/>
-                    <pic:cNvPicPr/>
-                  </pic:nvPicPr>
-                  <pic:blipFill>
-                    <a:blip r:embed="rId16"/>
-                    <a:stretch>
-                      <a:fillRect/>
-                    </a:stretch>
-                  </pic:blipFill>
-                  <pic:spPr>
-                    <a:xfrm>
-                      <a:off x="0" y="0"/>
-                      <a:ext cx="6355080" cy="2882895"/>
-                    </a:xfrm>
-                    <a:prstGeom prst="rect"/>
-                  </pic:spPr>
-                </pic:pic>
-              </a:graphicData>
-            </a:graphic>
-          </wp:inline>
-        </w:drawing>
-      </w:r>
-    </w:p>
-    <w:p>
-      <w:pPr>
-        <w:pStyle w:val="Heading2"/>
-      </w:pPr>
-      <w:r>
-        <w:t>Vehicule</w:t>
-      </w:r>
-    </w:p>
-    <w:p>
-      <w:pPr>
-        <w:jc w:val="center"/>
-      </w:pPr>
-      <w:r>
-        <w:drawing>
-          <wp:inline xmlns:a="http://schemas.openxmlformats.org/drawingml/2006/main" xmlns:pic="http://schemas.openxmlformats.org/drawingml/2006/picture">
-            <wp:extent cx="6355080" cy="3524180"/>
-            <wp:docPr id="7" name="Picture 7"/>
-            <wp:cNvGraphicFramePr>
-              <a:graphicFrameLocks noChangeAspect="1"/>
-            </wp:cNvGraphicFramePr>
-            <a:graphic>
-              <a:graphicData uri="http://schemas.openxmlformats.org/drawingml/2006/picture">
-                <pic:pic>
-                  <pic:nvPicPr>
-                    <pic:cNvPr id="0" name="autoloc-code-Vehicule.png"/>
-                    <pic:cNvPicPr/>
-                  </pic:nvPicPr>
-                  <pic:blipFill>
-                    <a:blip r:embed="rId17"/>
-                    <a:stretch>
-                      <a:fillRect/>
-                    </a:stretch>
-                  </pic:blipFill>
-                  <pic:spPr>
-                    <a:xfrm>
-                      <a:off x="0" y="0"/>
-                      <a:ext cx="6355080" cy="3524180"/>
+                      <a:ext cx="6309360" cy="6344559"/>
                     </a:xfrm>
                     <a:prstGeom prst="rect"/>
                   </pic:spPr>
@@ -652,12 +399,12 @@
         <w:pStyle w:val="Heading1"/>
       </w:pPr>
       <w:r>
-        <w:t>Base réellement générée dans phpMyAdmin</w:t>
+        <w:t>Base et tables générées dans phpMyAdmin</w:t>
       </w:r>
     </w:p>
     <w:p>
       <w:r>
-        <w:t>Capture de l’interface phpMyAdmin connectée au serveur XAMPP/MariaDB local après le redémarrage de l’application. Les 11 tables affichées comprennent les 9 tables d’entités et les 2 tables de liaison.</w:t>
+        <w:t>Capture du serveur phpMyAdmin/XAMPP après redémarrage : base autoloc_db_classes et ses 11 tables, dont les deux tables de liaison.</w:t>
       </w:r>
     </w:p>
     <w:p>
@@ -667,8 +414,8 @@
       <w:r>
         <w:drawing>
           <wp:inline xmlns:a="http://schemas.openxmlformats.org/drawingml/2006/main" xmlns:pic="http://schemas.openxmlformats.org/drawingml/2006/picture">
-            <wp:extent cx="6355080" cy="4766310"/>
-            <wp:docPr id="8" name="Picture 8"/>
+            <wp:extent cx="6355080" cy="4468416"/>
+            <wp:docPr id="2" name="Picture 2"/>
             <wp:cNvGraphicFramePr>
               <a:graphicFrameLocks noChangeAspect="1"/>
             </wp:cNvGraphicFramePr>
@@ -676,11 +423,11 @@
               <a:graphicData uri="http://schemas.openxmlformats.org/drawingml/2006/picture">
                 <pic:pic>
                   <pic:nvPicPr>
-                    <pic:cNvPr id="0" name="autoloc-database-structure.png"/>
+                    <pic:cNvPr id="0" name="autoloc-classes-final-schema.png"/>
                     <pic:cNvPicPr/>
                   </pic:nvPicPr>
                   <pic:blipFill>
-                    <a:blip r:embed="rId18"/>
+                    <a:blip r:embed="rId12"/>
                     <a:stretch>
                       <a:fillRect/>
                     </a:stretch>
@@ -688,59 +435,7 @@
                   <pic:spPr>
                     <a:xfrm>
                       <a:off x="0" y="0"/>
-                      <a:ext cx="6355080" cy="4766310"/>
-                    </a:xfrm>
-                    <a:prstGeom prst="rect"/>
-                  </pic:spPr>
-                </pic:pic>
-              </a:graphicData>
-            </a:graphic>
-          </wp:inline>
-        </w:drawing>
-      </w:r>
-    </w:p>
-    <w:p>
-      <w:pPr>
-        <w:pStyle w:val="Heading2"/>
-      </w:pPr>
-      <w:r>
-        <w:t>Relations visibles dans le Concepteur phpMyAdmin</w:t>
-      </w:r>
-    </w:p>
-    <w:p>
-      <w:r>
-        <w:t>Les traits représentent les clés étrangères matérialisées dans les tables InnoDB de cette base.</w:t>
-      </w:r>
-    </w:p>
-    <w:p>
-      <w:pPr>
-        <w:jc w:val="center"/>
-      </w:pPr>
-      <w:r>
-        <w:drawing>
-          <wp:inline xmlns:a="http://schemas.openxmlformats.org/drawingml/2006/main" xmlns:pic="http://schemas.openxmlformats.org/drawingml/2006/picture">
-            <wp:extent cx="6355080" cy="3299233"/>
-            <wp:docPr id="9" name="Picture 9"/>
-            <wp:cNvGraphicFramePr>
-              <a:graphicFrameLocks noChangeAspect="1"/>
-            </wp:cNvGraphicFramePr>
-            <a:graphic>
-              <a:graphicData uri="http://schemas.openxmlformats.org/drawingml/2006/picture">
-                <pic:pic>
-                  <pic:nvPicPr>
-                    <pic:cNvPr id="0" name="autoloc-phpmyadmin-designer-crop.png"/>
-                    <pic:cNvPicPr/>
-                  </pic:nvPicPr>
-                  <pic:blipFill>
-                    <a:blip r:embed="rId19"/>
-                    <a:stretch>
-                      <a:fillRect/>
-                    </a:stretch>
-                  </pic:blipFill>
-                  <pic:spPr>
-                    <a:xfrm>
-                      <a:off x="0" y="0"/>
-                      <a:ext cx="6355080" cy="3299233"/>
+                      <a:ext cx="6355080" cy="4468416"/>
                     </a:xfrm>
                     <a:prstGeom prst="rect"/>
                   </pic:spPr>
@@ -761,12 +456,12 @@
         <w:pStyle w:val="Heading1"/>
       </w:pPr>
       <w:r>
-        <w:t>Clés étrangères de la réservation</w:t>
+        <w:t>Relations dans le Concepteur phpMyAdmin</w:t>
       </w:r>
     </w:p>
     <w:p>
       <w:r>
-        <w:t>La structure phpMyAdmin confirme les trois colonnes de relation de réservation : id_client, id_contrat et id_vehicule; la clé de contrat est indexée de manière unique pour garantir le One-to-One.</w:t>
+        <w:t>Capture du concepteur phpMyAdmin : les lignes correspondent aux clés étrangères générées par Hibernate.</w:t>
       </w:r>
     </w:p>
     <w:p>
@@ -776,8 +471,8 @@
       <w:r>
         <w:drawing>
           <wp:inline xmlns:a="http://schemas.openxmlformats.org/drawingml/2006/main" xmlns:pic="http://schemas.openxmlformats.org/drawingml/2006/picture">
-            <wp:extent cx="6355080" cy="4299025"/>
-            <wp:docPr id="10" name="Picture 10"/>
+            <wp:extent cx="6355080" cy="4391394"/>
+            <wp:docPr id="3" name="Picture 3"/>
             <wp:cNvGraphicFramePr>
               <a:graphicFrameLocks noChangeAspect="1"/>
             </wp:cNvGraphicFramePr>
@@ -785,11 +480,11 @@
               <a:graphicData uri="http://schemas.openxmlformats.org/drawingml/2006/picture">
                 <pic:pic>
                   <pic:nvPicPr>
-                    <pic:cNvPr id="0" name="autoloc-phpmyadmin-reservation-constraints.png"/>
+                    <pic:cNvPr id="0" name="autoloc-classes-designer-crop.png"/>
                     <pic:cNvPicPr/>
                   </pic:nvPicPr>
                   <pic:blipFill>
-                    <a:blip r:embed="rId20"/>
+                    <a:blip r:embed="rId13"/>
                     <a:stretch>
                       <a:fillRect/>
                     </a:stretch>
@@ -797,7 +492,7 @@
                   <pic:spPr>
                     <a:xfrm>
                       <a:off x="0" y="0"/>
-                      <a:ext cx="6355080" cy="4299025"/>
+                      <a:ext cx="6355080" cy="4391394"/>
                     </a:xfrm>
                     <a:prstGeom prst="rect"/>
                   </pic:spPr>
@@ -810,27 +505,802 @@
     </w:p>
     <w:p>
       <w:pPr>
-        <w:pStyle w:val="Heading1"/>
+        <w:pStyle w:val="Heading2"/>
       </w:pPr>
       <w:r>
-        <w:t>Résultat de validation</w:t>
+        <w:t>Clé étrangère Employé - Agence</w:t>
       </w:r>
     </w:p>
     <w:p>
       <w:r>
-        <w:t>L’application a démarré avec Hibernate sur la base autoloc_db_associations. La métadonnée MySQL/MariaDB confirme les tables agence, client, contrat, contrat_paiements, employe, equipement, maintenance, paiement, reservation, vehicule et vehicule_equipement, ainsi que 9 clés étrangères.</w:t>
+        <w:t>La structure de la table employe confirme la colonne id_agence et sa référence vers agence.id_agence.</w:t>
+      </w:r>
+    </w:p>
+    <w:p>
+      <w:pPr>
+        <w:jc w:val="center"/>
+      </w:pPr>
+      <w:r>
+        <w:drawing>
+          <wp:inline xmlns:a="http://schemas.openxmlformats.org/drawingml/2006/main" xmlns:pic="http://schemas.openxmlformats.org/drawingml/2006/picture">
+            <wp:extent cx="6355080" cy="4112111"/>
+            <wp:docPr id="4" name="Picture 4"/>
+            <wp:cNvGraphicFramePr>
+              <a:graphicFrameLocks noChangeAspect="1"/>
+            </wp:cNvGraphicFramePr>
+            <a:graphic>
+              <a:graphicData uri="http://schemas.openxmlformats.org/drawingml/2006/picture">
+                <pic:pic>
+                  <pic:nvPicPr>
+                    <pic:cNvPr id="0" name="autoloc-classes-final-employe.png"/>
+                    <pic:cNvPicPr/>
+                  </pic:nvPicPr>
+                  <pic:blipFill>
+                    <a:blip r:embed="rId14"/>
+                    <a:stretch>
+                      <a:fillRect/>
+                    </a:stretch>
+                  </pic:blipFill>
+                  <pic:spPr>
+                    <a:xfrm>
+                      <a:off x="0" y="0"/>
+                      <a:ext cx="6355080" cy="4112111"/>
+                    </a:xfrm>
+                    <a:prstGeom prst="rect"/>
+                  </pic:spPr>
+                </pic:pic>
+              </a:graphicData>
+            </a:graphic>
+          </wp:inline>
+        </w:drawing>
       </w:r>
     </w:p>
     <w:p>
       <w:r>
-        <w:t>Les tests d’intégration sur H2 vérifient la présence des tables d’association et d’au moins 9 clés étrangères. Résultat Java 25 : 2 tests passés, 0 échec, 0 erreur.</w:t>
+        <w:br w:type="page"/>
+      </w:r>
+    </w:p>
+    <w:p>
+      <w:pPr>
+        <w:pStyle w:val="Heading1"/>
+      </w:pPr>
+      <w:r>
+        <w:t>Code Java complet des entités et énumérations</w:t>
+      </w:r>
+    </w:p>
+    <w:p>
+      <w:r>
+        <w:t>Chaque capture suivante montre le fichier Java complet d?une classe ou énumération du modèle.</w:t>
+      </w:r>
+    </w:p>
+    <w:p>
+      <w:pPr>
+        <w:pStyle w:val="Heading2"/>
+      </w:pPr>
+      <w:r>
+        <w:t>Entité - Agence.java</w:t>
+      </w:r>
+    </w:p>
+    <w:p>
+      <w:pPr>
+        <w:jc w:val="center"/>
+      </w:pPr>
+      <w:r>
+        <w:drawing>
+          <wp:inline xmlns:a="http://schemas.openxmlformats.org/drawingml/2006/main" xmlns:pic="http://schemas.openxmlformats.org/drawingml/2006/picture">
+            <wp:extent cx="6355080" cy="6439814"/>
+            <wp:docPr id="5" name="Picture 5"/>
+            <wp:cNvGraphicFramePr>
+              <a:graphicFrameLocks noChangeAspect="1"/>
+            </wp:cNvGraphicFramePr>
+            <a:graphic>
+              <a:graphicData uri="http://schemas.openxmlformats.org/drawingml/2006/picture">
+                <pic:pic>
+                  <pic:nvPicPr>
+                    <pic:cNvPr id="0" name="autoloc-fullsource-Agence.png"/>
+                    <pic:cNvPicPr/>
+                  </pic:nvPicPr>
+                  <pic:blipFill>
+                    <a:blip r:embed="rId15"/>
+                    <a:stretch>
+                      <a:fillRect/>
+                    </a:stretch>
+                  </pic:blipFill>
+                  <pic:spPr>
+                    <a:xfrm>
+                      <a:off x="0" y="0"/>
+                      <a:ext cx="6355080" cy="6439814"/>
+                    </a:xfrm>
+                    <a:prstGeom prst="rect"/>
+                  </pic:spPr>
+                </pic:pic>
+              </a:graphicData>
+            </a:graphic>
+          </wp:inline>
+        </w:drawing>
+      </w:r>
+    </w:p>
+    <w:p>
+      <w:r>
+        <w:br w:type="page"/>
+      </w:r>
+    </w:p>
+    <w:p>
+      <w:pPr>
+        <w:pStyle w:val="Heading2"/>
+      </w:pPr>
+      <w:r>
+        <w:t>Entité - Client.java</w:t>
+      </w:r>
+    </w:p>
+    <w:p>
+      <w:pPr>
+        <w:jc w:val="center"/>
+      </w:pPr>
+      <w:r>
+        <w:drawing>
+          <wp:inline xmlns:a="http://schemas.openxmlformats.org/drawingml/2006/main" xmlns:pic="http://schemas.openxmlformats.org/drawingml/2006/picture">
+            <wp:extent cx="6355080" cy="6766647"/>
+            <wp:docPr id="6" name="Picture 6"/>
+            <wp:cNvGraphicFramePr>
+              <a:graphicFrameLocks noChangeAspect="1"/>
+            </wp:cNvGraphicFramePr>
+            <a:graphic>
+              <a:graphicData uri="http://schemas.openxmlformats.org/drawingml/2006/picture">
+                <pic:pic>
+                  <pic:nvPicPr>
+                    <pic:cNvPr id="0" name="autoloc-fullsource-Client.png"/>
+                    <pic:cNvPicPr/>
+                  </pic:nvPicPr>
+                  <pic:blipFill>
+                    <a:blip r:embed="rId16"/>
+                    <a:stretch>
+                      <a:fillRect/>
+                    </a:stretch>
+                  </pic:blipFill>
+                  <pic:spPr>
+                    <a:xfrm>
+                      <a:off x="0" y="0"/>
+                      <a:ext cx="6355080" cy="6766647"/>
+                    </a:xfrm>
+                    <a:prstGeom prst="rect"/>
+                  </pic:spPr>
+                </pic:pic>
+              </a:graphicData>
+            </a:graphic>
+          </wp:inline>
+        </w:drawing>
+      </w:r>
+    </w:p>
+    <w:p>
+      <w:r>
+        <w:br w:type="page"/>
+      </w:r>
+    </w:p>
+    <w:p>
+      <w:pPr>
+        <w:pStyle w:val="Heading2"/>
+      </w:pPr>
+      <w:r>
+        <w:t>Entité - Contrat.java</w:t>
+      </w:r>
+    </w:p>
+    <w:p>
+      <w:pPr>
+        <w:jc w:val="center"/>
+      </w:pPr>
+      <w:r>
+        <w:drawing>
+          <wp:inline xmlns:a="http://schemas.openxmlformats.org/drawingml/2006/main" xmlns:pic="http://schemas.openxmlformats.org/drawingml/2006/picture">
+            <wp:extent cx="6355080" cy="6439814"/>
+            <wp:docPr id="7" name="Picture 7"/>
+            <wp:cNvGraphicFramePr>
+              <a:graphicFrameLocks noChangeAspect="1"/>
+            </wp:cNvGraphicFramePr>
+            <a:graphic>
+              <a:graphicData uri="http://schemas.openxmlformats.org/drawingml/2006/picture">
+                <pic:pic>
+                  <pic:nvPicPr>
+                    <pic:cNvPr id="0" name="autoloc-fullsource-Contrat.png"/>
+                    <pic:cNvPicPr/>
+                  </pic:nvPicPr>
+                  <pic:blipFill>
+                    <a:blip r:embed="rId17"/>
+                    <a:stretch>
+                      <a:fillRect/>
+                    </a:stretch>
+                  </pic:blipFill>
+                  <pic:spPr>
+                    <a:xfrm>
+                      <a:off x="0" y="0"/>
+                      <a:ext cx="6355080" cy="6439814"/>
+                    </a:xfrm>
+                    <a:prstGeom prst="rect"/>
+                  </pic:spPr>
+                </pic:pic>
+              </a:graphicData>
+            </a:graphic>
+          </wp:inline>
+        </w:drawing>
+      </w:r>
+    </w:p>
+    <w:p>
+      <w:r>
+        <w:br w:type="page"/>
+      </w:r>
+    </w:p>
+    <w:p>
+      <w:pPr>
+        <w:pStyle w:val="Heading2"/>
+      </w:pPr>
+      <w:r>
+        <w:t>Entité - Employe.java</w:t>
+      </w:r>
+    </w:p>
+    <w:p>
+      <w:pPr>
+        <w:jc w:val="center"/>
+      </w:pPr>
+      <w:r>
+        <w:drawing>
+          <wp:inline xmlns:a="http://schemas.openxmlformats.org/drawingml/2006/main" xmlns:pic="http://schemas.openxmlformats.org/drawingml/2006/picture">
+            <wp:extent cx="6355080" cy="5622733"/>
+            <wp:docPr id="8" name="Picture 8"/>
+            <wp:cNvGraphicFramePr>
+              <a:graphicFrameLocks noChangeAspect="1"/>
+            </wp:cNvGraphicFramePr>
+            <a:graphic>
+              <a:graphicData uri="http://schemas.openxmlformats.org/drawingml/2006/picture">
+                <pic:pic>
+                  <pic:nvPicPr>
+                    <pic:cNvPr id="0" name="autoloc-fullsource-Employe.png"/>
+                    <pic:cNvPicPr/>
+                  </pic:nvPicPr>
+                  <pic:blipFill>
+                    <a:blip r:embed="rId18"/>
+                    <a:stretch>
+                      <a:fillRect/>
+                    </a:stretch>
+                  </pic:blipFill>
+                  <pic:spPr>
+                    <a:xfrm>
+                      <a:off x="0" y="0"/>
+                      <a:ext cx="6355080" cy="5622733"/>
+                    </a:xfrm>
+                    <a:prstGeom prst="rect"/>
+                  </pic:spPr>
+                </pic:pic>
+              </a:graphicData>
+            </a:graphic>
+          </wp:inline>
+        </w:drawing>
+      </w:r>
+    </w:p>
+    <w:p>
+      <w:r>
+        <w:br w:type="page"/>
+      </w:r>
+    </w:p>
+    <w:p>
+      <w:pPr>
+        <w:pStyle w:val="Heading2"/>
+      </w:pPr>
+      <w:r>
+        <w:t>Entité - Equipement.java</w:t>
+      </w:r>
+    </w:p>
+    <w:p>
+      <w:pPr>
+        <w:jc w:val="center"/>
+      </w:pPr>
+      <w:r>
+        <w:drawing>
+          <wp:inline xmlns:a="http://schemas.openxmlformats.org/drawingml/2006/main" xmlns:pic="http://schemas.openxmlformats.org/drawingml/2006/picture">
+            <wp:extent cx="6355080" cy="4969067"/>
+            <wp:docPr id="9" name="Picture 9"/>
+            <wp:cNvGraphicFramePr>
+              <a:graphicFrameLocks noChangeAspect="1"/>
+            </wp:cNvGraphicFramePr>
+            <a:graphic>
+              <a:graphicData uri="http://schemas.openxmlformats.org/drawingml/2006/picture">
+                <pic:pic>
+                  <pic:nvPicPr>
+                    <pic:cNvPr id="0" name="autoloc-fullsource-Equipement.png"/>
+                    <pic:cNvPicPr/>
+                  </pic:nvPicPr>
+                  <pic:blipFill>
+                    <a:blip r:embed="rId19"/>
+                    <a:stretch>
+                      <a:fillRect/>
+                    </a:stretch>
+                  </pic:blipFill>
+                  <pic:spPr>
+                    <a:xfrm>
+                      <a:off x="0" y="0"/>
+                      <a:ext cx="6355080" cy="4969067"/>
+                    </a:xfrm>
+                    <a:prstGeom prst="rect"/>
+                  </pic:spPr>
+                </pic:pic>
+              </a:graphicData>
+            </a:graphic>
+          </wp:inline>
+        </w:drawing>
+      </w:r>
+    </w:p>
+    <w:p>
+      <w:r>
+        <w:br w:type="page"/>
+      </w:r>
+    </w:p>
+    <w:p>
+      <w:pPr>
+        <w:pStyle w:val="Heading2"/>
+      </w:pPr>
+      <w:r>
+        <w:t>Entité - Maintenance.java</w:t>
+      </w:r>
+    </w:p>
+    <w:p>
+      <w:pPr>
+        <w:jc w:val="center"/>
+      </w:pPr>
+      <w:r>
+        <w:drawing>
+          <wp:inline xmlns:a="http://schemas.openxmlformats.org/drawingml/2006/main" xmlns:pic="http://schemas.openxmlformats.org/drawingml/2006/picture">
+            <wp:extent cx="6355080" cy="5786149"/>
+            <wp:docPr id="10" name="Picture 10"/>
+            <wp:cNvGraphicFramePr>
+              <a:graphicFrameLocks noChangeAspect="1"/>
+            </wp:cNvGraphicFramePr>
+            <a:graphic>
+              <a:graphicData uri="http://schemas.openxmlformats.org/drawingml/2006/picture">
+                <pic:pic>
+                  <pic:nvPicPr>
+                    <pic:cNvPr id="0" name="autoloc-fullsource-Maintenance.png"/>
+                    <pic:cNvPicPr/>
+                  </pic:nvPicPr>
+                  <pic:blipFill>
+                    <a:blip r:embed="rId20"/>
+                    <a:stretch>
+                      <a:fillRect/>
+                    </a:stretch>
+                  </pic:blipFill>
+                  <pic:spPr>
+                    <a:xfrm>
+                      <a:off x="0" y="0"/>
+                      <a:ext cx="6355080" cy="5786149"/>
+                    </a:xfrm>
+                    <a:prstGeom prst="rect"/>
+                  </pic:spPr>
+                </pic:pic>
+              </a:graphicData>
+            </a:graphic>
+          </wp:inline>
+        </w:drawing>
+      </w:r>
+    </w:p>
+    <w:p>
+      <w:r>
+        <w:br w:type="page"/>
+      </w:r>
+    </w:p>
+    <w:p>
+      <w:pPr>
+        <w:pStyle w:val="Heading2"/>
+      </w:pPr>
+      <w:r>
+        <w:t>Entité - Paiement.java</w:t>
+      </w:r>
+    </w:p>
+    <w:p>
+      <w:pPr>
+        <w:jc w:val="center"/>
+      </w:pPr>
+      <w:r>
+        <w:drawing>
+          <wp:inline xmlns:a="http://schemas.openxmlformats.org/drawingml/2006/main" xmlns:pic="http://schemas.openxmlformats.org/drawingml/2006/picture">
+            <wp:extent cx="6355080" cy="5459316"/>
+            <wp:docPr id="11" name="Picture 11"/>
+            <wp:cNvGraphicFramePr>
+              <a:graphicFrameLocks noChangeAspect="1"/>
+            </wp:cNvGraphicFramePr>
+            <a:graphic>
+              <a:graphicData uri="http://schemas.openxmlformats.org/drawingml/2006/picture">
+                <pic:pic>
+                  <pic:nvPicPr>
+                    <pic:cNvPr id="0" name="autoloc-fullsource-Paiement.png"/>
+                    <pic:cNvPicPr/>
+                  </pic:nvPicPr>
+                  <pic:blipFill>
+                    <a:blip r:embed="rId21"/>
+                    <a:stretch>
+                      <a:fillRect/>
+                    </a:stretch>
+                  </pic:blipFill>
+                  <pic:spPr>
+                    <a:xfrm>
+                      <a:off x="0" y="0"/>
+                      <a:ext cx="6355080" cy="5459316"/>
+                    </a:xfrm>
+                    <a:prstGeom prst="rect"/>
+                  </pic:spPr>
+                </pic:pic>
+              </a:graphicData>
+            </a:graphic>
+          </wp:inline>
+        </w:drawing>
+      </w:r>
+    </w:p>
+    <w:p>
+      <w:r>
+        <w:br w:type="page"/>
+      </w:r>
+    </w:p>
+    <w:p>
+      <w:pPr>
+        <w:pStyle w:val="Heading2"/>
+      </w:pPr>
+      <w:r>
+        <w:t>Entité - Reservation.java</w:t>
+      </w:r>
+    </w:p>
+    <w:p>
+      <w:pPr>
+        <w:jc w:val="center"/>
+      </w:pPr>
+      <w:r>
+        <w:drawing>
+          <wp:inline xmlns:a="http://schemas.openxmlformats.org/drawingml/2006/main" xmlns:pic="http://schemas.openxmlformats.org/drawingml/2006/picture">
+            <wp:extent cx="6355080" cy="7256896"/>
+            <wp:docPr id="12" name="Picture 12"/>
+            <wp:cNvGraphicFramePr>
+              <a:graphicFrameLocks noChangeAspect="1"/>
+            </wp:cNvGraphicFramePr>
+            <a:graphic>
+              <a:graphicData uri="http://schemas.openxmlformats.org/drawingml/2006/picture">
+                <pic:pic>
+                  <pic:nvPicPr>
+                    <pic:cNvPr id="0" name="autoloc-fullsource-Reservation.png"/>
+                    <pic:cNvPicPr/>
+                  </pic:nvPicPr>
+                  <pic:blipFill>
+                    <a:blip r:embed="rId22"/>
+                    <a:stretch>
+                      <a:fillRect/>
+                    </a:stretch>
+                  </pic:blipFill>
+                  <pic:spPr>
+                    <a:xfrm>
+                      <a:off x="0" y="0"/>
+                      <a:ext cx="6355080" cy="7256896"/>
+                    </a:xfrm>
+                    <a:prstGeom prst="rect"/>
+                  </pic:spPr>
+                </pic:pic>
+              </a:graphicData>
+            </a:graphic>
+          </wp:inline>
+        </w:drawing>
+      </w:r>
+    </w:p>
+    <w:p>
+      <w:r>
+        <w:br w:type="page"/>
+      </w:r>
+    </w:p>
+    <w:p>
+      <w:pPr>
+        <w:pStyle w:val="Heading2"/>
+      </w:pPr>
+      <w:r>
+        <w:t>Entité - Vehicule.java</w:t>
+      </w:r>
+    </w:p>
+    <w:p>
+      <w:pPr>
+        <w:jc w:val="center"/>
+      </w:pPr>
+      <w:r>
+        <w:drawing>
+          <wp:inline xmlns:a="http://schemas.openxmlformats.org/drawingml/2006/main" xmlns:pic="http://schemas.openxmlformats.org/drawingml/2006/picture">
+            <wp:extent cx="6355080" cy="10034974"/>
+            <wp:docPr id="13" name="Picture 13"/>
+            <wp:cNvGraphicFramePr>
+              <a:graphicFrameLocks noChangeAspect="1"/>
+            </wp:cNvGraphicFramePr>
+            <a:graphic>
+              <a:graphicData uri="http://schemas.openxmlformats.org/drawingml/2006/picture">
+                <pic:pic>
+                  <pic:nvPicPr>
+                    <pic:cNvPr id="0" name="autoloc-fullsource-Vehicule.png"/>
+                    <pic:cNvPicPr/>
+                  </pic:nvPicPr>
+                  <pic:blipFill>
+                    <a:blip r:embed="rId23"/>
+                    <a:stretch>
+                      <a:fillRect/>
+                    </a:stretch>
+                  </pic:blipFill>
+                  <pic:spPr>
+                    <a:xfrm>
+                      <a:off x="0" y="0"/>
+                      <a:ext cx="6355080" cy="10034974"/>
+                    </a:xfrm>
+                    <a:prstGeom prst="rect"/>
+                  </pic:spPr>
+                </pic:pic>
+              </a:graphicData>
+            </a:graphic>
+          </wp:inline>
+        </w:drawing>
+      </w:r>
+    </w:p>
+    <w:p>
+      <w:r>
+        <w:br w:type="page"/>
+      </w:r>
+    </w:p>
+    <w:p>
+      <w:pPr>
+        <w:pStyle w:val="Heading2"/>
+      </w:pPr>
+      <w:r>
+        <w:t>Énumération - CategorieVehicule.java</w:t>
+      </w:r>
+    </w:p>
+    <w:p>
+      <w:pPr>
+        <w:jc w:val="center"/>
+      </w:pPr>
+      <w:r>
+        <w:drawing>
+          <wp:inline xmlns:a="http://schemas.openxmlformats.org/drawingml/2006/main" xmlns:pic="http://schemas.openxmlformats.org/drawingml/2006/picture">
+            <wp:extent cx="6355080" cy="1864157"/>
+            <wp:docPr id="14" name="Picture 14"/>
+            <wp:cNvGraphicFramePr>
+              <a:graphicFrameLocks noChangeAspect="1"/>
+            </wp:cNvGraphicFramePr>
+            <a:graphic>
+              <a:graphicData uri="http://schemas.openxmlformats.org/drawingml/2006/picture">
+                <pic:pic>
+                  <pic:nvPicPr>
+                    <pic:cNvPr id="0" name="autoloc-fullsource-CategorieVehicule.png"/>
+                    <pic:cNvPicPr/>
+                  </pic:nvPicPr>
+                  <pic:blipFill>
+                    <a:blip r:embed="rId24"/>
+                    <a:stretch>
+                      <a:fillRect/>
+                    </a:stretch>
+                  </pic:blipFill>
+                  <pic:spPr>
+                    <a:xfrm>
+                      <a:off x="0" y="0"/>
+                      <a:ext cx="6355080" cy="1864157"/>
+                    </a:xfrm>
+                    <a:prstGeom prst="rect"/>
+                  </pic:spPr>
+                </pic:pic>
+              </a:graphicData>
+            </a:graphic>
+          </wp:inline>
+        </w:drawing>
+      </w:r>
+    </w:p>
+    <w:p>
+      <w:r>
+        <w:br w:type="page"/>
+      </w:r>
+    </w:p>
+    <w:p>
+      <w:pPr>
+        <w:pStyle w:val="Heading2"/>
+      </w:pPr>
+      <w:r>
+        <w:t>Énumération - ModePaiement.java</w:t>
+      </w:r>
+    </w:p>
+    <w:p>
+      <w:pPr>
+        <w:jc w:val="center"/>
+      </w:pPr>
+      <w:r>
+        <w:drawing>
+          <wp:inline xmlns:a="http://schemas.openxmlformats.org/drawingml/2006/main" xmlns:pic="http://schemas.openxmlformats.org/drawingml/2006/picture">
+            <wp:extent cx="6355080" cy="1700740"/>
+            <wp:docPr id="15" name="Picture 15"/>
+            <wp:cNvGraphicFramePr>
+              <a:graphicFrameLocks noChangeAspect="1"/>
+            </wp:cNvGraphicFramePr>
+            <a:graphic>
+              <a:graphicData uri="http://schemas.openxmlformats.org/drawingml/2006/picture">
+                <pic:pic>
+                  <pic:nvPicPr>
+                    <pic:cNvPr id="0" name="autoloc-fullsource-ModePaiement.png"/>
+                    <pic:cNvPicPr/>
+                  </pic:nvPicPr>
+                  <pic:blipFill>
+                    <a:blip r:embed="rId25"/>
+                    <a:stretch>
+                      <a:fillRect/>
+                    </a:stretch>
+                  </pic:blipFill>
+                  <pic:spPr>
+                    <a:xfrm>
+                      <a:off x="0" y="0"/>
+                      <a:ext cx="6355080" cy="1700740"/>
+                    </a:xfrm>
+                    <a:prstGeom prst="rect"/>
+                  </pic:spPr>
+                </pic:pic>
+              </a:graphicData>
+            </a:graphic>
+          </wp:inline>
+        </w:drawing>
+      </w:r>
+    </w:p>
+    <w:p>
+      <w:r>
+        <w:br w:type="page"/>
+      </w:r>
+    </w:p>
+    <w:p>
+      <w:pPr>
+        <w:pStyle w:val="Heading2"/>
+      </w:pPr>
+      <w:r>
+        <w:t>Énumération - RoleEmploye.java</w:t>
+      </w:r>
+    </w:p>
+    <w:p>
+      <w:pPr>
+        <w:jc w:val="center"/>
+      </w:pPr>
+      <w:r>
+        <w:drawing>
+          <wp:inline xmlns:a="http://schemas.openxmlformats.org/drawingml/2006/main" xmlns:pic="http://schemas.openxmlformats.org/drawingml/2006/picture">
+            <wp:extent cx="6355080" cy="1537324"/>
+            <wp:docPr id="16" name="Picture 16"/>
+            <wp:cNvGraphicFramePr>
+              <a:graphicFrameLocks noChangeAspect="1"/>
+            </wp:cNvGraphicFramePr>
+            <a:graphic>
+              <a:graphicData uri="http://schemas.openxmlformats.org/drawingml/2006/picture">
+                <pic:pic>
+                  <pic:nvPicPr>
+                    <pic:cNvPr id="0" name="autoloc-fullsource-RoleEmploye.png"/>
+                    <pic:cNvPicPr/>
+                  </pic:nvPicPr>
+                  <pic:blipFill>
+                    <a:blip r:embed="rId26"/>
+                    <a:stretch>
+                      <a:fillRect/>
+                    </a:stretch>
+                  </pic:blipFill>
+                  <pic:spPr>
+                    <a:xfrm>
+                      <a:off x="0" y="0"/>
+                      <a:ext cx="6355080" cy="1537324"/>
+                    </a:xfrm>
+                    <a:prstGeom prst="rect"/>
+                  </pic:spPr>
+                </pic:pic>
+              </a:graphicData>
+            </a:graphic>
+          </wp:inline>
+        </w:drawing>
+      </w:r>
+    </w:p>
+    <w:p>
+      <w:r>
+        <w:br w:type="page"/>
+      </w:r>
+    </w:p>
+    <w:p>
+      <w:pPr>
+        <w:pStyle w:val="Heading2"/>
+      </w:pPr>
+      <w:r>
+        <w:t>Énumération - StatutReservation.java</w:t>
+      </w:r>
+    </w:p>
+    <w:p>
+      <w:pPr>
+        <w:jc w:val="center"/>
+      </w:pPr>
+      <w:r>
+        <w:drawing>
+          <wp:inline xmlns:a="http://schemas.openxmlformats.org/drawingml/2006/main" xmlns:pic="http://schemas.openxmlformats.org/drawingml/2006/picture">
+            <wp:extent cx="6355080" cy="1864157"/>
+            <wp:docPr id="17" name="Picture 17"/>
+            <wp:cNvGraphicFramePr>
+              <a:graphicFrameLocks noChangeAspect="1"/>
+            </wp:cNvGraphicFramePr>
+            <a:graphic>
+              <a:graphicData uri="http://schemas.openxmlformats.org/drawingml/2006/picture">
+                <pic:pic>
+                  <pic:nvPicPr>
+                    <pic:cNvPr id="0" name="autoloc-fullsource-StatutReservation.png"/>
+                    <pic:cNvPicPr/>
+                  </pic:nvPicPr>
+                  <pic:blipFill>
+                    <a:blip r:embed="rId27"/>
+                    <a:stretch>
+                      <a:fillRect/>
+                    </a:stretch>
+                  </pic:blipFill>
+                  <pic:spPr>
+                    <a:xfrm>
+                      <a:off x="0" y="0"/>
+                      <a:ext cx="6355080" cy="1864157"/>
+                    </a:xfrm>
+                    <a:prstGeom prst="rect"/>
+                  </pic:spPr>
+                </pic:pic>
+              </a:graphicData>
+            </a:graphic>
+          </wp:inline>
+        </w:drawing>
+      </w:r>
+    </w:p>
+    <w:p>
+      <w:r>
+        <w:br w:type="page"/>
+      </w:r>
+    </w:p>
+    <w:p>
+      <w:pPr>
+        <w:pStyle w:val="Heading2"/>
+      </w:pPr>
+      <w:r>
+        <w:t>Énumération - StatutVehicule.java</w:t>
+      </w:r>
+    </w:p>
+    <w:p>
+      <w:pPr>
+        <w:jc w:val="center"/>
+      </w:pPr>
+      <w:r>
+        <w:drawing>
+          <wp:inline xmlns:a="http://schemas.openxmlformats.org/drawingml/2006/main" xmlns:pic="http://schemas.openxmlformats.org/drawingml/2006/picture">
+            <wp:extent cx="6355080" cy="1700740"/>
+            <wp:docPr id="18" name="Picture 18"/>
+            <wp:cNvGraphicFramePr>
+              <a:graphicFrameLocks noChangeAspect="1"/>
+            </wp:cNvGraphicFramePr>
+            <a:graphic>
+              <a:graphicData uri="http://schemas.openxmlformats.org/drawingml/2006/picture">
+                <pic:pic>
+                  <pic:nvPicPr>
+                    <pic:cNvPr id="0" name="autoloc-fullsource-StatutVehicule.png"/>
+                    <pic:cNvPicPr/>
+                  </pic:nvPicPr>
+                  <pic:blipFill>
+                    <a:blip r:embed="rId28"/>
+                    <a:stretch>
+                      <a:fillRect/>
+                    </a:stretch>
+                  </pic:blipFill>
+                  <pic:spPr>
+                    <a:xfrm>
+                      <a:off x="0" y="0"/>
+                      <a:ext cx="6355080" cy="1700740"/>
+                    </a:xfrm>
+                    <a:prstGeom prst="rect"/>
+                  </pic:spPr>
+                </pic:pic>
+              </a:graphicData>
+            </a:graphic>
+          </wp:inline>
+        </w:drawing>
       </w:r>
     </w:p>
     <w:sectPr>
       <w:headerReference w:type="default" r:id="rId9"/>
       <w:footerReference w:type="default" r:id="rId10"/>
-      <w:pgSz w:w="12240" w:h="15840"/>
-      <w:pgMar w:top="792" w:right="936" w:bottom="864" w:left="936" w:header="720" w:footer="720" w:gutter="0"/>
+      <w:pgSz w:w="11909" w:h="16834"/>
+      <w:pgMar w:top="936" w:right="864" w:bottom="936" w:left="864" w:header="720" w:footer="720" w:gutter="0"/>
       <w:cols w:space="720"/>
       <w:docGrid w:linePitch="360"/>
     </w:sectPr>
@@ -846,7 +1316,7 @@
       <w:jc w:val="center"/>
     </w:pPr>
     <w:r>
-      <w:t>Projet AutoLoc ? Rapport de g?n?ration du sch?ma relationnel</w:t>
+      <w:t>AutoLoc API - Rapport des classes et associations</w:t>
     </w:r>
   </w:p>
 </w:ftr>
@@ -856,10 +1326,10 @@
 <w:hdr xmlns:m="http://schemas.openxmlformats.org/officeDocument/2006/math" xmlns:mc="http://schemas.openxmlformats.org/markup-compatibility/2006" xmlns:mo="http://schemas.microsoft.com/office/mac/office/2008/main" xmlns:mv="urn:schemas-microsoft-com:mac:vml" xmlns:o="urn:schemas-microsoft-com:office:office" xmlns:r="http://schemas.openxmlformats.org/officeDocument/2006/relationships" xmlns:v="urn:schemas-microsoft-com:vml" xmlns:w10="urn:schemas-microsoft-com:office:word" xmlns:w14="http://schemas.microsoft.com/office/word/2010/wordml" xmlns:w="http://schemas.openxmlformats.org/wordprocessingml/2006/main" xmlns:wne="http://schemas.microsoft.com/office/word/2006/wordml" xmlns:wp14="http://schemas.microsoft.com/office/word/2010/wordprocessingDrawing" xmlns:wp="http://schemas.openxmlformats.org/drawingml/2006/wordprocessingDrawing" xmlns:wpc="http://schemas.microsoft.com/office/word/2010/wordprocessingCanvas" xmlns:wpg="http://schemas.microsoft.com/office/word/2010/wordprocessingGroup" xmlns:wpi="http://schemas.microsoft.com/office/word/2010/wordprocessingInk" xmlns:wps="http://schemas.microsoft.com/office/word/2010/wordprocessingShape" mc:Ignorable="w14 wp14">
   <w:p>
     <w:pPr>
-      <w:pStyle w:val="Caption"/>
+      <w:pStyle w:val="Header"/>
     </w:pPr>
     <w:r>
-      <w:t>AUTOLOC  |  ASSOCIATIONS JPA  |  08 octobre 2026</w:t>
+      <w:t>AUTOLOC  |  CLASSES, ASSOCIATIONS ET SCHÉMA SQL</w:t>
     </w:r>
   </w:p>
 </w:hdr>
@@ -1296,7 +1766,7 @@
       <w:b/>
       <w:bCs/>
       <w:color w:val="365F91" w:themeColor="accent1" w:themeShade="BF"/>
-      <w:sz w:val="36"/>
+      <w:sz w:val="34"/>
       <w:szCs w:val="28"/>
     </w:rPr>
   </w:style>
@@ -1320,7 +1790,7 @@
       <w:b/>
       <w:bCs/>
       <w:color w:val="4F81BD" w:themeColor="accent1"/>
-      <w:sz w:val="26"/>
+      <w:sz w:val="24"/>
       <w:szCs w:val="26"/>
     </w:rPr>
   </w:style>
@@ -1585,7 +2055,7 @@
       <w:color w:val="17365D" w:themeColor="text2" w:themeShade="BF"/>
       <w:spacing w:val="5"/>
       <w:kern w:val="28"/>
-      <w:sz w:val="52"/>
+      <w:sz w:val="48"/>
       <w:szCs w:val="52"/>
     </w:rPr>
   </w:style>

</xml_diff>